<commit_message>
feat: use September business document references (v51)
</commit_message>
<xml_diff>
--- a/docs/templates/invoice-org.docx
+++ b/docs/templates/invoice-org.docx
@@ -98,6 +98,7 @@
             <w:pPr>
               <w:keepNext w:val="0"/>
               <w:keepLines w:val="0"/>
+              <w:pageBreakBefore w:val="0"/>
               <w:widowControl w:val="0"/>
               <w:pBdr>
                 <w:top w:space="0" w:sz="0" w:val="nil"/>
@@ -150,19 +151,8 @@
           </w:tcPr>
           <w:p>
             <w:pPr>
-              <w:keepNext w:val="0"/>
-              <w:keepLines w:val="0"/>
               <w:widowControl w:val="0"/>
-              <w:pBdr>
-                <w:top w:space="0" w:sz="0" w:val="nil"/>
-                <w:left w:space="0" w:sz="0" w:val="nil"/>
-                <w:bottom w:space="0" w:sz="0" w:val="nil"/>
-                <w:right w:space="0" w:sz="0" w:val="nil"/>
-                <w:between w:space="0" w:sz="0" w:val="nil"/>
-              </w:pBdr>
-              <w:shd w:fill="auto" w:val="clear"/>
-              <w:spacing w:after="0" w:before="0" w:line="240" w:lineRule="auto"/>
-              <w:ind w:left="0" w:right="0" w:firstLine="0"/>
+              <w:spacing w:line="240" w:lineRule="auto"/>
               <w:jc w:val="both"/>
               <w:rPr>
                 <w:rFonts w:ascii="Times New Roman" w:cs="Times New Roman" w:eastAsia="Times New Roman" w:hAnsi="Times New Roman"/>
@@ -185,6 +175,7 @@
       <w:tr>
         <w:trPr>
           <w:cantSplit w:val="0"/>
+          <w:trHeight w:val="902.9296875" w:hRule="atLeast"/>
           <w:tblHeader w:val="0"/>
         </w:trPr>
         <w:tc>
@@ -208,6 +199,7 @@
             <w:pPr>
               <w:keepNext w:val="0"/>
               <w:keepLines w:val="0"/>
+              <w:pageBreakBefore w:val="0"/>
               <w:widowControl w:val="0"/>
               <w:pBdr>
                 <w:top w:space="0" w:sz="0" w:val="nil"/>
@@ -306,6 +298,7 @@
             <w:pPr>
               <w:keepNext w:val="0"/>
               <w:keepLines w:val="0"/>
+              <w:pageBreakBefore w:val="0"/>
               <w:widowControl w:val="0"/>
               <w:pBdr>
                 <w:top w:space="0" w:sz="0" w:val="nil"/>
@@ -360,6 +353,7 @@
             <w:pPr>
               <w:keepNext w:val="0"/>
               <w:keepLines w:val="0"/>
+              <w:pageBreakBefore w:val="0"/>
               <w:widowControl w:val="0"/>
               <w:pBdr>
                 <w:top w:space="0" w:sz="0" w:val="nil"/>
@@ -425,16 +419,16 @@
       </w:tblPr>
       <w:tblGrid>
         <w:gridCol w:w="645"/>
-        <w:gridCol w:w="4665"/>
-        <w:gridCol w:w="960"/>
+        <w:gridCol w:w="4470"/>
+        <w:gridCol w:w="1155"/>
         <w:gridCol w:w="1095"/>
         <w:gridCol w:w="1440"/>
         <w:gridCol w:w="1635"/>
         <w:tblGridChange w:id="0">
           <w:tblGrid>
             <w:gridCol w:w="645"/>
-            <w:gridCol w:w="4665"/>
-            <w:gridCol w:w="960"/>
+            <w:gridCol w:w="4470"/>
+            <w:gridCol w:w="1155"/>
             <w:gridCol w:w="1095"/>
             <w:gridCol w:w="1440"/>
             <w:gridCol w:w="1635"/>
@@ -444,7 +438,7 @@
       <w:tr>
         <w:trPr>
           <w:cantSplit w:val="0"/>
-          <w:tblHeader w:val="0"/>
+          <w:tblHeader w:val="1"/>
         </w:trPr>
         <w:tc>
           <w:tcPr>
@@ -464,6 +458,7 @@
             <w:pPr>
               <w:keepNext w:val="0"/>
               <w:keepLines w:val="0"/>
+              <w:pageBreakBefore w:val="0"/>
               <w:widowControl w:val="0"/>
               <w:pBdr>
                 <w:top w:space="0" w:sz="0" w:val="nil"/>
@@ -515,6 +510,7 @@
             <w:pPr>
               <w:keepNext w:val="0"/>
               <w:keepLines w:val="0"/>
+              <w:pageBreakBefore w:val="0"/>
               <w:widowControl w:val="0"/>
               <w:pBdr>
                 <w:top w:space="0" w:sz="0" w:val="nil"/>
@@ -564,8 +560,49 @@
           </w:tcPr>
           <w:p>
             <w:pPr>
+              <w:widowControl w:val="0"/>
+              <w:spacing w:line="240" w:lineRule="auto"/>
+              <w:jc w:val="center"/>
+              <w:rPr>
+                <w:rFonts w:ascii="Times New Roman" w:cs="Times New Roman" w:eastAsia="Times New Roman" w:hAnsi="Times New Roman"/>
+                <w:b w:val="1"/>
+                <w:bCs w:val="1"/>
+                <w:sz w:val="24"/>
+                <w:szCs w:val="24"/>
+              </w:rPr>
+            </w:pPr>
+            <w:r>
+              <w:rPr>
+                <w:rFonts w:ascii="Times New Roman" w:cs="Times New Roman" w:eastAsia="Times New Roman" w:hAnsi="Times New Roman"/>
+                <w:b w:val="1"/>
+                <w:bCs w:val="1"/>
+                <w:sz w:val="24"/>
+                <w:szCs w:val="24"/>
+                <w:rtl w:val="0"/>
+              </w:rPr>
+              <w:t xml:space="preserve">Ед. изм.</w:t>
+            </w:r>
+          </w:p>
+        </w:tc>
+        <w:tc>
+          <w:tcPr>
+            <w:tcBorders>
+              <w:bottom w:color="000000" w:space="0" w:sz="6" w:val="single"/>
+            </w:tcBorders>
+            <w:shd w:fill="auto" w:val="clear"/>
+            <w:tcMar>
+              <w:top w:w="100.0" w:type="dxa"/>
+              <w:left w:w="100.0" w:type="dxa"/>
+              <w:bottom w:w="100.0" w:type="dxa"/>
+              <w:right w:w="100.0" w:type="dxa"/>
+            </w:tcMar>
+            <w:vAlign w:val="top"/>
+          </w:tcPr>
+          <w:p>
+            <w:pPr>
               <w:keepNext w:val="0"/>
               <w:keepLines w:val="0"/>
+              <w:pageBreakBefore w:val="0"/>
               <w:widowControl w:val="0"/>
               <w:pBdr>
                 <w:top w:space="0" w:sz="0" w:val="nil"/>
@@ -617,6 +654,7 @@
             <w:pPr>
               <w:keepNext w:val="0"/>
               <w:keepLines w:val="0"/>
+              <w:pageBreakBefore w:val="0"/>
               <w:widowControl w:val="0"/>
               <w:pBdr>
                 <w:top w:space="0" w:sz="0" w:val="nil"/>
@@ -646,7 +684,7 @@
                 <w:szCs w:val="24"/>
                 <w:rtl w:val="0"/>
               </w:rPr>
-              <w:t xml:space="preserve">Ед. изм.</w:t>
+              <w:t xml:space="preserve">Цена (руб.)</w:t>
             </w:r>
           </w:p>
         </w:tc>
@@ -668,6 +706,7 @@
             <w:pPr>
               <w:keepNext w:val="0"/>
               <w:keepLines w:val="0"/>
+              <w:pageBreakBefore w:val="0"/>
               <w:widowControl w:val="0"/>
               <w:pBdr>
                 <w:top w:space="0" w:sz="0" w:val="nil"/>
@@ -697,15 +736,94 @@
                 <w:szCs w:val="24"/>
                 <w:rtl w:val="0"/>
               </w:rPr>
-              <w:t xml:space="preserve">Цена (руб.)</w:t>
-            </w:r>
-          </w:p>
-        </w:tc>
+              <w:t xml:space="preserve">Сумма (руб.)</w:t>
+            </w:r>
+          </w:p>
+        </w:tc>
+      </w:tr>
+      <!--items:0:start-->
+      <w:tr>
+        <w:trPr>
+          <w:cantSplit w:val="0"/>
+          <w:tblHeader w:val="0"/>
+        </w:trPr>
         <w:tc>
           <w:tcPr>
             <w:tcBorders>
+              <w:top w:color="cccccc" w:space="0" w:sz="6" w:val="single"/>
+              <w:left w:color="000000" w:space="0" w:sz="6" w:val="single"/>
               <w:bottom w:color="000000" w:space="0" w:sz="6" w:val="single"/>
+              <w:right w:color="000000" w:space="0" w:sz="6" w:val="single"/>
             </w:tcBorders>
+            <w:shd w:fill="auto" w:val="clear"/>
+            <w:tcMar>
+              <w:top w:w="99.77952755905513" w:type="dxa"/>
+              <w:left w:w="99.77952755905513" w:type="dxa"/>
+              <w:bottom w:w="99.77952755905513" w:type="dxa"/>
+              <w:right w:w="99.77952755905513" w:type="dxa"/>
+            </w:tcMar>
+          </w:tcPr>
+          <w:p>
+            <w:pPr>
+              <w:spacing w:line="240" w:lineRule="auto"/>
+              <w:jc w:val="center"/>
+              <w:rPr>
+                <w:rFonts w:ascii="Times New Roman" w:cs="Times New Roman" w:eastAsia="Times New Roman" w:hAnsi="Times New Roman"/>
+                <w:sz w:val="24"/>
+                <w:szCs w:val="24"/>
+              </w:rPr>
+            </w:pPr>
+            <w:r>
+              <w:rPr>
+                <w:rFonts w:ascii="Times New Roman" w:cs="Times New Roman" w:eastAsia="Times New Roman" w:hAnsi="Times New Roman"/>
+                <w:sz w:val="24"/>
+                <w:szCs w:val="24"/>
+                <w:rtl w:val="0"/>
+              </w:rPr>
+              <w:t xml:space="preserve">{{invoiceItemNumber}}</w:t>
+            </w:r>
+          </w:p>
+        </w:tc>
+        <w:tc>
+          <w:tcPr>
+            <w:tcBorders>
+              <w:top w:color="000000" w:space="0" w:sz="4" w:val="single"/>
+              <w:left w:color="000000" w:space="0" w:sz="4" w:val="single"/>
+              <w:bottom w:color="000000" w:space="0" w:sz="4" w:val="single"/>
+              <w:right w:color="000000" w:space="0" w:sz="4" w:val="single"/>
+            </w:tcBorders>
+            <w:shd w:fill="auto" w:val="clear"/>
+            <w:tcMar>
+              <w:top w:w="99.77952755905513" w:type="dxa"/>
+              <w:left w:w="99.77952755905513" w:type="dxa"/>
+              <w:bottom w:w="99.77952755905513" w:type="dxa"/>
+              <w:right w:w="99.77952755905513" w:type="dxa"/>
+            </w:tcMar>
+            <w:vAlign w:val="center"/>
+          </w:tcPr>
+          <w:p>
+            <w:pPr>
+              <w:widowControl w:val="0"/>
+              <w:spacing w:line="240" w:lineRule="auto"/>
+              <w:rPr>
+                <w:rFonts w:ascii="Times New Roman" w:cs="Times New Roman" w:eastAsia="Times New Roman" w:hAnsi="Times New Roman"/>
+                <w:sz w:val="24"/>
+                <w:szCs w:val="24"/>
+              </w:rPr>
+            </w:pPr>
+            <w:r>
+              <w:rPr>
+                <w:rFonts w:ascii="Times New Roman" w:cs="Times New Roman" w:eastAsia="Times New Roman" w:hAnsi="Times New Roman"/>
+                <w:sz w:val="24"/>
+                <w:szCs w:val="24"/>
+                <w:rtl w:val="0"/>
+              </w:rPr>
+              <w:t xml:space="preserve">{{itemName}}</w:t>
+            </w:r>
+          </w:p>
+        </w:tc>
+        <w:tc>
+          <w:tcPr>
             <w:shd w:fill="auto" w:val="clear"/>
             <w:tcMar>
               <w:top w:w="100.0" w:type="dxa"/>
@@ -717,8 +835,151 @@
           </w:tcPr>
           <w:p>
             <w:pPr>
+              <w:widowControl w:val="0"/>
+              <w:spacing w:line="240" w:lineRule="auto"/>
+              <w:jc w:val="center"/>
+              <w:rPr>
+                <w:rFonts w:ascii="Times New Roman" w:cs="Times New Roman" w:eastAsia="Times New Roman" w:hAnsi="Times New Roman"/>
+                <w:sz w:val="24"/>
+                <w:szCs w:val="24"/>
+              </w:rPr>
+            </w:pPr>
+            <w:r>
+              <w:rPr>
+                <w:rFonts w:ascii="Times New Roman" w:cs="Times New Roman" w:eastAsia="Times New Roman" w:hAnsi="Times New Roman"/>
+                <w:sz w:val="24"/>
+                <w:szCs w:val="24"/>
+                <w:rtl w:val="0"/>
+              </w:rPr>
+              <w:t xml:space="preserve">{{itemUnit}}</w:t>
+            </w:r>
+          </w:p>
+        </w:tc>
+        <w:tc>
+          <w:tcPr>
+            <w:shd w:fill="auto" w:val="clear"/>
+            <w:tcMar>
+              <w:top w:w="100.0" w:type="dxa"/>
+              <w:left w:w="100.0" w:type="dxa"/>
+              <w:bottom w:w="100.0" w:type="dxa"/>
+              <w:right w:w="100.0" w:type="dxa"/>
+            </w:tcMar>
+            <w:vAlign w:val="top"/>
+          </w:tcPr>
+          <w:p>
+            <w:pPr>
+              <w:widowControl w:val="0"/>
+              <w:spacing w:line="240" w:lineRule="auto"/>
+              <w:jc w:val="center"/>
+              <w:rPr>
+                <w:rFonts w:ascii="Times New Roman" w:cs="Times New Roman" w:eastAsia="Times New Roman" w:hAnsi="Times New Roman"/>
+                <w:sz w:val="24"/>
+                <w:szCs w:val="24"/>
+              </w:rPr>
+            </w:pPr>
+            <w:r>
+              <w:rPr>
+                <w:rFonts w:ascii="Times New Roman" w:cs="Times New Roman" w:eastAsia="Times New Roman" w:hAnsi="Times New Roman"/>
+                <w:sz w:val="24"/>
+                <w:szCs w:val="24"/>
+                <w:rtl w:val="0"/>
+              </w:rPr>
+              <w:t xml:space="preserve">{{itemQuantity}}</w:t>
+            </w:r>
+          </w:p>
+        </w:tc>
+        <w:tc>
+          <w:tcPr>
+            <w:shd w:fill="auto" w:val="clear"/>
+            <w:tcMar>
+              <w:top w:w="100.0" w:type="dxa"/>
+              <w:left w:w="100.0" w:type="dxa"/>
+              <w:bottom w:w="100.0" w:type="dxa"/>
+              <w:right w:w="100.0" w:type="dxa"/>
+            </w:tcMar>
+            <w:vAlign w:val="top"/>
+          </w:tcPr>
+          <w:p>
+            <w:pPr>
+              <w:widowControl w:val="0"/>
+              <w:spacing w:line="240" w:lineRule="auto"/>
+              <w:jc w:val="right"/>
+              <w:rPr>
+                <w:rFonts w:ascii="Times New Roman" w:cs="Times New Roman" w:eastAsia="Times New Roman" w:hAnsi="Times New Roman"/>
+                <w:sz w:val="24"/>
+                <w:szCs w:val="24"/>
+              </w:rPr>
+            </w:pPr>
+            <w:r>
+              <w:rPr>
+                <w:rFonts w:ascii="Times New Roman" w:cs="Times New Roman" w:eastAsia="Times New Roman" w:hAnsi="Times New Roman"/>
+                <w:sz w:val="24"/>
+                <w:szCs w:val="24"/>
+                <w:rtl w:val="0"/>
+              </w:rPr>
+              <w:t xml:space="preserve">{{itemPrice}}</w:t>
+            </w:r>
+          </w:p>
+        </w:tc>
+        <w:tc>
+          <w:tcPr>
+            <w:shd w:fill="auto" w:val="clear"/>
+            <w:tcMar>
+              <w:top w:w="100.0" w:type="dxa"/>
+              <w:left w:w="100.0" w:type="dxa"/>
+              <w:bottom w:w="100.0" w:type="dxa"/>
+              <w:right w:w="100.0" w:type="dxa"/>
+            </w:tcMar>
+            <w:vAlign w:val="top"/>
+          </w:tcPr>
+          <w:p>
+            <w:pPr>
+              <w:widowControl w:val="0"/>
+              <w:spacing w:line="240" w:lineRule="auto"/>
+              <w:jc w:val="right"/>
+              <w:rPr>
+                <w:rFonts w:ascii="Times New Roman" w:cs="Times New Roman" w:eastAsia="Times New Roman" w:hAnsi="Times New Roman"/>
+                <w:sz w:val="24"/>
+                <w:szCs w:val="24"/>
+              </w:rPr>
+            </w:pPr>
+            <w:r>
+              <w:rPr>
+                <w:rFonts w:ascii="Times New Roman" w:cs="Times New Roman" w:eastAsia="Times New Roman" w:hAnsi="Times New Roman"/>
+                <w:sz w:val="24"/>
+                <w:szCs w:val="24"/>
+                <w:rtl w:val="0"/>
+              </w:rPr>
+              <w:t xml:space="preserve">{{itemTotal}}</w:t>
+            </w:r>
+          </w:p>
+        </w:tc>
+      </w:tr>
+      <!--items:0:end-->
+      <w:tr>
+        <w:trPr>
+          <w:cantSplit w:val="0"/>
+          <w:tblHeader w:val="0"/>
+        </w:trPr>
+        <w:tc>
+          <w:tcPr>
+            <w:tcBorders>
+              <w:bottom w:color="000000" w:space="0" w:sz="4" w:val="single"/>
+            </w:tcBorders>
+            <w:shd w:fill="auto" w:val="clear"/>
+            <w:tcMar>
+              <w:top w:w="100.0" w:type="dxa"/>
+              <w:left w:w="100.0" w:type="dxa"/>
+              <w:bottom w:w="100.0" w:type="dxa"/>
+              <w:right w:w="100.0" w:type="dxa"/>
+            </w:tcMar>
+            <w:vAlign w:val="top"/>
+          </w:tcPr>
+          <w:p>
+            <w:pPr>
               <w:keepNext w:val="0"/>
               <w:keepLines w:val="0"/>
+              <w:pageBreakBefore w:val="0"/>
               <w:widowControl w:val="0"/>
               <w:pBdr>
                 <w:top w:space="0" w:sz="0" w:val="nil"/>
@@ -733,983 +994,22 @@
               <w:jc w:val="center"/>
               <w:rPr>
                 <w:rFonts w:ascii="Times New Roman" w:cs="Times New Roman" w:eastAsia="Times New Roman" w:hAnsi="Times New Roman"/>
-                <w:b w:val="1"/>
-                <w:bCs w:val="1"/>
-                <w:sz w:val="24"/>
-                <w:szCs w:val="24"/>
-              </w:rPr>
-            </w:pPr>
-            <w:r>
-              <w:rPr>
-                <w:rFonts w:ascii="Times New Roman" w:cs="Times New Roman" w:eastAsia="Times New Roman" w:hAnsi="Times New Roman"/>
-                <w:b w:val="1"/>
-                <w:bCs w:val="1"/>
-                <w:sz w:val="24"/>
-                <w:szCs w:val="24"/>
-                <w:rtl w:val="0"/>
-              </w:rPr>
-              <w:t xml:space="preserve">Сумма (руб.)</w:t>
-            </w:r>
-          </w:p>
-        </w:tc>
-      </w:tr>
-      <!--items:0:start-->
-      <w:tr>
-        <w:trPr>
-          <w:cantSplit w:val="0"/>
-          <w:tblHeader w:val="0"/>
-        </w:trPr>
-        <w:tc>
-          <w:tcPr>
+                <w:sz w:val="24"/>
+                <w:szCs w:val="24"/>
+              </w:rPr>
+            </w:pPr>
+            <w:r>
+              <w:rPr>
+                <w:rtl w:val="0"/>
+              </w:rPr>
+            </w:r>
+          </w:p>
+        </w:tc>
+        <w:tc>
+          <w:tcPr>
+            <w:gridSpan w:val="4"/>
             <w:tcBorders>
-              <w:top w:color="000000" w:space="0" w:sz="6" w:val="single"/>
-              <w:left w:color="000000" w:space="0" w:sz="6" w:val="single"/>
-              <w:bottom w:color="000000" w:space="0" w:sz="6" w:val="single"/>
-              <w:right w:color="000000" w:space="0" w:sz="6" w:val="single"/>
-            </w:tcBorders>
-            <w:shd w:fill="auto" w:val="clear"/>
-            <w:tcMar>
-              <w:top w:w="99.77952755905513" w:type="dxa"/>
-              <w:left w:w="99.77952755905513" w:type="dxa"/>
-              <w:bottom w:w="99.77952755905513" w:type="dxa"/>
-              <w:right w:w="99.77952755905513" w:type="dxa"/>
-            </w:tcMar>
-          </w:tcPr>
-          <w:p>
-            <w:pPr>
-              <w:spacing w:line="240" w:lineRule="auto"/>
-              <w:jc w:val="center"/>
-              <w:rPr>
-                <w:rFonts w:ascii="Times New Roman" w:cs="Times New Roman" w:eastAsia="Times New Roman" w:hAnsi="Times New Roman"/>
-                <w:sz w:val="24"/>
-                <w:szCs w:val="24"/>
-              </w:rPr>
-            </w:pPr>
-            <w:r>
-              <w:rPr>
-                <w:rFonts w:ascii="Times New Roman" w:cs="Times New Roman" w:eastAsia="Times New Roman" w:hAnsi="Times New Roman"/>
-                <w:sz w:val="24"/>
-                <w:szCs w:val="24"/>
-                <w:rtl w:val="0"/>
-              </w:rPr>
-              <w:t xml:space="preserve">{{invoiceItemNumber}}</w:t>
-            </w:r>
-          </w:p>
-        </w:tc>
-        <w:tc>
-          <w:tcPr>
-            <w:tcBorders>
-              <w:top w:color="000000" w:space="0" w:sz="6" w:val="single"/>
-              <w:left w:color="000000" w:space="0" w:sz="6" w:val="single"/>
-              <w:bottom w:color="000000" w:space="0" w:sz="6" w:val="single"/>
-              <w:right w:color="000000" w:space="0" w:sz="6" w:val="single"/>
-            </w:tcBorders>
-            <w:shd w:fill="auto" w:val="clear"/>
-            <w:tcMar>
-              <w:top w:w="99.77952755905513" w:type="dxa"/>
-              <w:left w:w="99.77952755905513" w:type="dxa"/>
-              <w:bottom w:w="99.77952755905513" w:type="dxa"/>
-              <w:right w:w="99.77952755905513" w:type="dxa"/>
-            </w:tcMar>
-          </w:tcPr>
-          <w:p>
-            <w:pPr>
-              <w:spacing w:line="240" w:lineRule="auto"/>
-              <w:jc w:val="both"/>
-              <w:rPr>
-                <w:rFonts w:ascii="Times New Roman" w:cs="Times New Roman" w:eastAsia="Times New Roman" w:hAnsi="Times New Roman"/>
-                <w:sz w:val="24"/>
-                <w:szCs w:val="24"/>
-              </w:rPr>
-            </w:pPr>
-            <w:r>
-              <w:rPr>
-                <w:rFonts w:ascii="Times New Roman" w:cs="Times New Roman" w:eastAsia="Times New Roman" w:hAnsi="Times New Roman"/>
-                <w:sz w:val="24"/>
-                <w:szCs w:val="24"/>
-                <w:rtl w:val="0"/>
-              </w:rPr>
-              <w:t xml:space="preserve">{{itemName}}</w:t>
-            </w:r>
-          </w:p>
-        </w:tc>
-        <w:tc>
-          <w:tcPr>
-            <w:tcBorders>
-              <w:top w:color="000000" w:space="0" w:sz="6" w:val="single"/>
-              <w:left w:color="000000" w:space="0" w:sz="6" w:val="single"/>
-              <w:bottom w:color="000000" w:space="0" w:sz="6" w:val="single"/>
-              <w:right w:color="000000" w:space="0" w:sz="6" w:val="single"/>
-            </w:tcBorders>
-            <w:shd w:fill="auto" w:val="clear"/>
-            <w:tcMar>
-              <w:top w:w="99.77952755905513" w:type="dxa"/>
-              <w:left w:w="99.77952755905513" w:type="dxa"/>
-              <w:bottom w:w="99.77952755905513" w:type="dxa"/>
-              <w:right w:w="99.77952755905513" w:type="dxa"/>
-            </w:tcMar>
-            <w:vAlign w:val="center"/>
-          </w:tcPr>
-          <w:p>
-            <w:pPr>
-              <w:spacing w:line="240" w:lineRule="auto"/>
-              <w:jc w:val="center"/>
-              <w:rPr>
-                <w:rFonts w:ascii="Times New Roman" w:cs="Times New Roman" w:eastAsia="Times New Roman" w:hAnsi="Times New Roman"/>
-                <w:sz w:val="24"/>
-                <w:szCs w:val="24"/>
-              </w:rPr>
-            </w:pPr>
-            <w:r>
-              <w:rPr>
-                <w:rFonts w:ascii="Times New Roman" w:cs="Times New Roman" w:eastAsia="Times New Roman" w:hAnsi="Times New Roman"/>
-                <w:sz w:val="24"/>
-                <w:szCs w:val="24"/>
-                <w:rtl w:val="0"/>
-              </w:rPr>
-              <w:t xml:space="preserve">{{itemQuantity}}</w:t>
-            </w:r>
-          </w:p>
-        </w:tc>
-        <w:tc>
-          <w:tcPr>
-            <w:tcBorders>
-              <w:top w:color="000000" w:space="0" w:sz="6" w:val="single"/>
-              <w:left w:color="000000" w:space="0" w:sz="6" w:val="single"/>
-              <w:bottom w:color="000000" w:space="0" w:sz="6" w:val="single"/>
-              <w:right w:color="000000" w:space="0" w:sz="6" w:val="single"/>
-            </w:tcBorders>
-            <w:shd w:fill="auto" w:val="clear"/>
-            <w:tcMar>
-              <w:top w:w="99.77952755905513" w:type="dxa"/>
-              <w:left w:w="99.77952755905513" w:type="dxa"/>
-              <w:bottom w:w="99.77952755905513" w:type="dxa"/>
-              <w:right w:w="99.77952755905513" w:type="dxa"/>
-            </w:tcMar>
-            <w:vAlign w:val="center"/>
-          </w:tcPr>
-          <w:p>
-            <w:pPr>
-              <w:widowControl w:val="0"/>
-              <w:spacing w:line="240" w:lineRule="auto"/>
-              <w:jc w:val="center"/>
-              <w:rPr>
-                <w:rFonts w:ascii="Times New Roman" w:cs="Times New Roman" w:eastAsia="Times New Roman" w:hAnsi="Times New Roman"/>
-                <w:sz w:val="24"/>
-                <w:szCs w:val="24"/>
-              </w:rPr>
-            </w:pPr>
-            <w:r>
-              <w:rPr>
-                <w:rFonts w:ascii="Times New Roman" w:cs="Times New Roman" w:eastAsia="Times New Roman" w:hAnsi="Times New Roman"/>
-                <w:sz w:val="24"/>
-                <w:szCs w:val="24"/>
-                <w:rtl w:val="0"/>
-              </w:rPr>
-              <w:t xml:space="preserve">{{itemUnit}}</w:t>
-            </w:r>
-          </w:p>
-        </w:tc>
-        <w:tc>
-          <w:tcPr>
-            <w:tcBorders>
-              <w:top w:color="000000" w:space="0" w:sz="6" w:val="single"/>
-              <w:left w:color="000000" w:space="0" w:sz="6" w:val="single"/>
-              <w:bottom w:color="000000" w:space="0" w:sz="6" w:val="single"/>
-              <w:right w:color="000000" w:space="0" w:sz="6" w:val="single"/>
-            </w:tcBorders>
-            <w:shd w:fill="auto" w:val="clear"/>
-            <w:tcMar>
-              <w:top w:w="99.77952755905513" w:type="dxa"/>
-              <w:left w:w="99.77952755905513" w:type="dxa"/>
-              <w:bottom w:w="99.77952755905513" w:type="dxa"/>
-              <w:right w:w="99.77952755905513" w:type="dxa"/>
-            </w:tcMar>
-            <w:vAlign w:val="center"/>
-          </w:tcPr>
-          <w:p>
-            <w:pPr>
-              <w:widowControl w:val="0"/>
-              <w:spacing w:line="240" w:lineRule="auto"/>
-              <w:jc w:val="center"/>
-              <w:rPr>
-                <w:rFonts w:ascii="Times New Roman" w:cs="Times New Roman" w:eastAsia="Times New Roman" w:hAnsi="Times New Roman"/>
-                <w:sz w:val="24"/>
-                <w:szCs w:val="24"/>
-              </w:rPr>
-            </w:pPr>
-            <w:r>
-              <w:rPr>
-                <w:rFonts w:ascii="Times New Roman" w:cs="Times New Roman" w:eastAsia="Times New Roman" w:hAnsi="Times New Roman"/>
-                <w:sz w:val="24"/>
-                <w:szCs w:val="24"/>
-                <w:rtl w:val="0"/>
-              </w:rPr>
-              <w:t xml:space="preserve">{{itemPrice}}</w:t>
-            </w:r>
-          </w:p>
-        </w:tc>
-        <w:tc>
-          <w:tcPr>
-            <w:tcBorders>
-              <w:top w:color="000000" w:space="0" w:sz="6" w:val="single"/>
-              <w:left w:color="000000" w:space="0" w:sz="6" w:val="single"/>
-              <w:bottom w:color="000000" w:space="0" w:sz="6" w:val="single"/>
-              <w:right w:color="000000" w:space="0" w:sz="6" w:val="single"/>
-            </w:tcBorders>
-            <w:shd w:fill="auto" w:val="clear"/>
-            <w:tcMar>
-              <w:top w:w="99.77952755905513" w:type="dxa"/>
-              <w:left w:w="99.77952755905513" w:type="dxa"/>
-              <w:bottom w:w="99.77952755905513" w:type="dxa"/>
-              <w:right w:w="99.77952755905513" w:type="dxa"/>
-            </w:tcMar>
-            <w:vAlign w:val="center"/>
-          </w:tcPr>
-          <w:p>
-            <w:pPr>
-              <w:widowControl w:val="0"/>
-              <w:spacing w:line="240" w:lineRule="auto"/>
-              <w:jc w:val="center"/>
-              <w:rPr>
-                <w:rFonts w:ascii="Times New Roman" w:cs="Times New Roman" w:eastAsia="Times New Roman" w:hAnsi="Times New Roman"/>
-                <w:sz w:val="24"/>
-                <w:szCs w:val="24"/>
-              </w:rPr>
-            </w:pPr>
-            <w:r>
-              <w:rPr>
-                <w:rFonts w:ascii="Times New Roman" w:cs="Times New Roman" w:eastAsia="Times New Roman" w:hAnsi="Times New Roman"/>
-                <w:sz w:val="24"/>
-                <w:szCs w:val="24"/>
-                <w:rtl w:val="0"/>
-              </w:rPr>
-              <w:t xml:space="preserve">{{itemTotal}}</w:t>
-            </w:r>
-          </w:p>
-        </w:tc>
-      </w:tr>
-      <!--items:0:end-->
-      <!--items:1:start-->
-      <w:tr>
-        <w:trPr>
-          <w:cantSplit w:val="0"/>
-          <w:tblHeader w:val="0"/>
-        </w:trPr>
-        <w:tc>
-          <w:tcPr>
-            <w:tcBorders>
-              <w:top w:color="000000" w:space="0" w:sz="6" w:val="single"/>
-              <w:left w:color="000000" w:space="0" w:sz="6" w:val="single"/>
-              <w:bottom w:color="000000" w:space="0" w:sz="6" w:val="single"/>
-              <w:right w:color="000000" w:space="0" w:sz="6" w:val="single"/>
-            </w:tcBorders>
-            <w:shd w:fill="auto" w:val="clear"/>
-            <w:tcMar>
-              <w:top w:w="99.77952755905513" w:type="dxa"/>
-              <w:left w:w="99.77952755905513" w:type="dxa"/>
-              <w:bottom w:w="99.77952755905513" w:type="dxa"/>
-              <w:right w:w="99.77952755905513" w:type="dxa"/>
-            </w:tcMar>
-          </w:tcPr>
-          <w:p>
-            <w:pPr>
-              <w:spacing w:line="240" w:lineRule="auto"/>
-              <w:jc w:val="center"/>
-              <w:rPr>
-                <w:rFonts w:ascii="Times New Roman" w:cs="Times New Roman" w:eastAsia="Times New Roman" w:hAnsi="Times New Roman"/>
-                <w:sz w:val="24"/>
-                <w:szCs w:val="24"/>
-              </w:rPr>
-            </w:pPr>
-            <w:r>
-              <w:rPr>
-                <w:rFonts w:ascii="Times New Roman" w:cs="Times New Roman" w:eastAsia="Times New Roman" w:hAnsi="Times New Roman"/>
-                <w:sz w:val="24"/>
-                <w:szCs w:val="24"/>
-                <w:rtl w:val="0"/>
-              </w:rPr>
-              <w:t xml:space="preserve">{{invoiceItemNumber}}</w:t>
-            </w:r>
-          </w:p>
-        </w:tc>
-        <w:tc>
-          <w:tcPr>
-            <w:tcBorders>
-              <w:top w:color="000000" w:space="0" w:sz="6" w:val="single"/>
-              <w:left w:color="000000" w:space="0" w:sz="6" w:val="single"/>
-              <w:bottom w:color="000000" w:space="0" w:sz="6" w:val="single"/>
-              <w:right w:color="000000" w:space="0" w:sz="6" w:val="single"/>
-            </w:tcBorders>
-            <w:shd w:fill="auto" w:val="clear"/>
-            <w:tcMar>
-              <w:top w:w="99.77952755905513" w:type="dxa"/>
-              <w:left w:w="99.77952755905513" w:type="dxa"/>
-              <w:bottom w:w="99.77952755905513" w:type="dxa"/>
-              <w:right w:w="99.77952755905513" w:type="dxa"/>
-            </w:tcMar>
-          </w:tcPr>
-          <w:p>
-            <w:pPr>
-              <w:spacing w:line="240" w:lineRule="auto"/>
-              <w:jc w:val="both"/>
-              <w:rPr>
-                <w:rFonts w:ascii="Times New Roman" w:cs="Times New Roman" w:eastAsia="Times New Roman" w:hAnsi="Times New Roman"/>
-                <w:sz w:val="24"/>
-                <w:szCs w:val="24"/>
-              </w:rPr>
-            </w:pPr>
-            <w:r>
-              <w:rPr>
-                <w:rFonts w:ascii="Times New Roman" w:cs="Times New Roman" w:eastAsia="Times New Roman" w:hAnsi="Times New Roman"/>
-                <w:sz w:val="24"/>
-                <w:szCs w:val="24"/>
-                <w:rtl w:val="0"/>
-              </w:rPr>
-              <w:t xml:space="preserve">{{itemName}}</w:t>
-            </w:r>
-          </w:p>
-        </w:tc>
-        <w:tc>
-          <w:tcPr>
-            <w:tcBorders>
-              <w:top w:color="000000" w:space="0" w:sz="6" w:val="single"/>
-              <w:left w:color="000000" w:space="0" w:sz="6" w:val="single"/>
-              <w:bottom w:color="000000" w:space="0" w:sz="6" w:val="single"/>
-              <w:right w:color="000000" w:space="0" w:sz="6" w:val="single"/>
-            </w:tcBorders>
-            <w:shd w:fill="auto" w:val="clear"/>
-            <w:tcMar>
-              <w:top w:w="99.77952755905513" w:type="dxa"/>
-              <w:left w:w="99.77952755905513" w:type="dxa"/>
-              <w:bottom w:w="99.77952755905513" w:type="dxa"/>
-              <w:right w:w="99.77952755905513" w:type="dxa"/>
-            </w:tcMar>
-            <w:vAlign w:val="center"/>
-          </w:tcPr>
-          <w:p>
-            <w:pPr>
-              <w:spacing w:line="240" w:lineRule="auto"/>
-              <w:jc w:val="center"/>
-              <w:rPr>
-                <w:rFonts w:ascii="Times New Roman" w:cs="Times New Roman" w:eastAsia="Times New Roman" w:hAnsi="Times New Roman"/>
-                <w:sz w:val="24"/>
-                <w:szCs w:val="24"/>
-              </w:rPr>
-            </w:pPr>
-            <w:r>
-              <w:rPr>
-                <w:rFonts w:ascii="Times New Roman" w:cs="Times New Roman" w:eastAsia="Times New Roman" w:hAnsi="Times New Roman"/>
-                <w:sz w:val="24"/>
-                <w:szCs w:val="24"/>
-                <w:rtl w:val="0"/>
-              </w:rPr>
-              <w:t xml:space="preserve">{{itemQuantity}}</w:t>
-            </w:r>
-          </w:p>
-        </w:tc>
-        <w:tc>
-          <w:tcPr>
-            <w:tcBorders>
-              <w:top w:color="000000" w:space="0" w:sz="6" w:val="single"/>
-              <w:left w:color="000000" w:space="0" w:sz="6" w:val="single"/>
-              <w:bottom w:color="000000" w:space="0" w:sz="6" w:val="single"/>
-              <w:right w:color="000000" w:space="0" w:sz="6" w:val="single"/>
-            </w:tcBorders>
-            <w:shd w:fill="auto" w:val="clear"/>
-            <w:tcMar>
-              <w:top w:w="99.77952755905513" w:type="dxa"/>
-              <w:left w:w="99.77952755905513" w:type="dxa"/>
-              <w:bottom w:w="99.77952755905513" w:type="dxa"/>
-              <w:right w:w="99.77952755905513" w:type="dxa"/>
-            </w:tcMar>
-            <w:vAlign w:val="center"/>
-          </w:tcPr>
-          <w:p>
-            <w:pPr>
-              <w:widowControl w:val="0"/>
-              <w:spacing w:line="240" w:lineRule="auto"/>
-              <w:jc w:val="center"/>
-              <w:rPr>
-                <w:rFonts w:ascii="Times New Roman" w:cs="Times New Roman" w:eastAsia="Times New Roman" w:hAnsi="Times New Roman"/>
-                <w:sz w:val="24"/>
-                <w:szCs w:val="24"/>
-              </w:rPr>
-            </w:pPr>
-            <w:r>
-              <w:rPr>
-                <w:rFonts w:ascii="Times New Roman" w:cs="Times New Roman" w:eastAsia="Times New Roman" w:hAnsi="Times New Roman"/>
-                <w:sz w:val="24"/>
-                <w:szCs w:val="24"/>
-                <w:rtl w:val="0"/>
-              </w:rPr>
-              <w:t xml:space="preserve">{{itemUnit}}</w:t>
-            </w:r>
-          </w:p>
-        </w:tc>
-        <w:tc>
-          <w:tcPr>
-            <w:tcBorders>
-              <w:top w:color="000000" w:space="0" w:sz="6" w:val="single"/>
-              <w:left w:color="000000" w:space="0" w:sz="6" w:val="single"/>
-              <w:bottom w:color="000000" w:space="0" w:sz="6" w:val="single"/>
-              <w:right w:color="000000" w:space="0" w:sz="6" w:val="single"/>
-            </w:tcBorders>
-            <w:shd w:fill="auto" w:val="clear"/>
-            <w:tcMar>
-              <w:top w:w="99.77952755905513" w:type="dxa"/>
-              <w:left w:w="99.77952755905513" w:type="dxa"/>
-              <w:bottom w:w="99.77952755905513" w:type="dxa"/>
-              <w:right w:w="99.77952755905513" w:type="dxa"/>
-            </w:tcMar>
-            <w:vAlign w:val="center"/>
-          </w:tcPr>
-          <w:p>
-            <w:pPr>
-              <w:widowControl w:val="0"/>
-              <w:spacing w:line="240" w:lineRule="auto"/>
-              <w:jc w:val="center"/>
-              <w:rPr>
-                <w:rFonts w:ascii="Times New Roman" w:cs="Times New Roman" w:eastAsia="Times New Roman" w:hAnsi="Times New Roman"/>
-                <w:sz w:val="24"/>
-                <w:szCs w:val="24"/>
-              </w:rPr>
-            </w:pPr>
-            <w:r>
-              <w:rPr>
-                <w:rFonts w:ascii="Times New Roman" w:cs="Times New Roman" w:eastAsia="Times New Roman" w:hAnsi="Times New Roman"/>
-                <w:sz w:val="24"/>
-                <w:szCs w:val="24"/>
-                <w:rtl w:val="0"/>
-              </w:rPr>
-              <w:t xml:space="preserve">{{itemPrice}}</w:t>
-            </w:r>
-          </w:p>
-        </w:tc>
-        <w:tc>
-          <w:tcPr>
-            <w:tcBorders>
-              <w:top w:color="000000" w:space="0" w:sz="6" w:val="single"/>
-              <w:left w:color="000000" w:space="0" w:sz="6" w:val="single"/>
-              <w:bottom w:color="000000" w:space="0" w:sz="6" w:val="single"/>
-              <w:right w:color="000000" w:space="0" w:sz="6" w:val="single"/>
-            </w:tcBorders>
-            <w:shd w:fill="auto" w:val="clear"/>
-            <w:tcMar>
-              <w:top w:w="99.77952755905513" w:type="dxa"/>
-              <w:left w:w="99.77952755905513" w:type="dxa"/>
-              <w:bottom w:w="99.77952755905513" w:type="dxa"/>
-              <w:right w:w="99.77952755905513" w:type="dxa"/>
-            </w:tcMar>
-            <w:vAlign w:val="center"/>
-          </w:tcPr>
-          <w:p>
-            <w:pPr>
-              <w:widowControl w:val="0"/>
-              <w:spacing w:line="240" w:lineRule="auto"/>
-              <w:jc w:val="center"/>
-              <w:rPr>
-                <w:rFonts w:ascii="Times New Roman" w:cs="Times New Roman" w:eastAsia="Times New Roman" w:hAnsi="Times New Roman"/>
-                <w:sz w:val="24"/>
-                <w:szCs w:val="24"/>
-              </w:rPr>
-            </w:pPr>
-            <w:r>
-              <w:rPr>
-                <w:rFonts w:ascii="Times New Roman" w:cs="Times New Roman" w:eastAsia="Times New Roman" w:hAnsi="Times New Roman"/>
-                <w:sz w:val="24"/>
-                <w:szCs w:val="24"/>
-                <w:rtl w:val="0"/>
-              </w:rPr>
-              <w:t xml:space="preserve">{{itemTotal}}</w:t>
-            </w:r>
-          </w:p>
-        </w:tc>
-      </w:tr>
-      <!--items:1:end-->
-      <!--items:2:start-->
-      <w:tr>
-        <w:trPr>
-          <w:cantSplit w:val="0"/>
-          <w:tblHeader w:val="0"/>
-        </w:trPr>
-        <w:tc>
-          <w:tcPr>
-            <w:tcBorders>
-              <w:top w:color="000000" w:space="0" w:sz="6" w:val="single"/>
-              <w:left w:color="000000" w:space="0" w:sz="6" w:val="single"/>
-              <w:bottom w:color="000000" w:space="0" w:sz="6" w:val="single"/>
-              <w:right w:color="000000" w:space="0" w:sz="6" w:val="single"/>
-            </w:tcBorders>
-            <w:shd w:fill="auto" w:val="clear"/>
-            <w:tcMar>
-              <w:top w:w="99.77952755905513" w:type="dxa"/>
-              <w:left w:w="99.77952755905513" w:type="dxa"/>
-              <w:bottom w:w="99.77952755905513" w:type="dxa"/>
-              <w:right w:w="99.77952755905513" w:type="dxa"/>
-            </w:tcMar>
-          </w:tcPr>
-          <w:p>
-            <w:pPr>
-              <w:spacing w:line="240" w:lineRule="auto"/>
-              <w:jc w:val="center"/>
-              <w:rPr>
-                <w:rFonts w:ascii="Times New Roman" w:cs="Times New Roman" w:eastAsia="Times New Roman" w:hAnsi="Times New Roman"/>
-                <w:sz w:val="24"/>
-                <w:szCs w:val="24"/>
-              </w:rPr>
-            </w:pPr>
-            <w:r>
-              <w:rPr>
-                <w:rFonts w:ascii="Times New Roman" w:cs="Times New Roman" w:eastAsia="Times New Roman" w:hAnsi="Times New Roman"/>
-                <w:sz w:val="24"/>
-                <w:szCs w:val="24"/>
-                <w:rtl w:val="0"/>
-              </w:rPr>
-              <w:t xml:space="preserve">{{invoiceItemNumber}}</w:t>
-            </w:r>
-          </w:p>
-        </w:tc>
-        <w:tc>
-          <w:tcPr>
-            <w:tcBorders>
-              <w:top w:color="000000" w:space="0" w:sz="6" w:val="single"/>
-              <w:left w:color="000000" w:space="0" w:sz="6" w:val="single"/>
-              <w:bottom w:color="000000" w:space="0" w:sz="6" w:val="single"/>
-              <w:right w:color="000000" w:space="0" w:sz="6" w:val="single"/>
-            </w:tcBorders>
-            <w:shd w:fill="auto" w:val="clear"/>
-            <w:tcMar>
-              <w:top w:w="99.77952755905513" w:type="dxa"/>
-              <w:left w:w="99.77952755905513" w:type="dxa"/>
-              <w:bottom w:w="99.77952755905513" w:type="dxa"/>
-              <w:right w:w="99.77952755905513" w:type="dxa"/>
-            </w:tcMar>
-          </w:tcPr>
-          <w:p>
-            <w:pPr>
-              <w:spacing w:line="240" w:lineRule="auto"/>
-              <w:jc w:val="both"/>
-              <w:rPr>
-                <w:rFonts w:ascii="Times New Roman" w:cs="Times New Roman" w:eastAsia="Times New Roman" w:hAnsi="Times New Roman"/>
-                <w:sz w:val="24"/>
-                <w:szCs w:val="24"/>
-              </w:rPr>
-            </w:pPr>
-            <w:r>
-              <w:rPr>
-                <w:rFonts w:ascii="Times New Roman" w:cs="Times New Roman" w:eastAsia="Times New Roman" w:hAnsi="Times New Roman"/>
-                <w:sz w:val="24"/>
-                <w:szCs w:val="24"/>
-                <w:rtl w:val="0"/>
-              </w:rPr>
-              <w:t xml:space="preserve">{{itemName}}</w:t>
-            </w:r>
-          </w:p>
-        </w:tc>
-        <w:tc>
-          <w:tcPr>
-            <w:tcBorders>
-              <w:top w:color="000000" w:space="0" w:sz="6" w:val="single"/>
-              <w:left w:color="000000" w:space="0" w:sz="6" w:val="single"/>
-              <w:bottom w:color="000000" w:space="0" w:sz="6" w:val="single"/>
-              <w:right w:color="000000" w:space="0" w:sz="6" w:val="single"/>
-            </w:tcBorders>
-            <w:shd w:fill="auto" w:val="clear"/>
-            <w:tcMar>
-              <w:top w:w="99.77952755905513" w:type="dxa"/>
-              <w:left w:w="99.77952755905513" w:type="dxa"/>
-              <w:bottom w:w="99.77952755905513" w:type="dxa"/>
-              <w:right w:w="99.77952755905513" w:type="dxa"/>
-            </w:tcMar>
-            <w:vAlign w:val="center"/>
-          </w:tcPr>
-          <w:p>
-            <w:pPr>
-              <w:spacing w:line="240" w:lineRule="auto"/>
-              <w:jc w:val="center"/>
-              <w:rPr>
-                <w:rFonts w:ascii="Times New Roman" w:cs="Times New Roman" w:eastAsia="Times New Roman" w:hAnsi="Times New Roman"/>
-                <w:sz w:val="24"/>
-                <w:szCs w:val="24"/>
-              </w:rPr>
-            </w:pPr>
-            <w:r>
-              <w:rPr>
-                <w:rFonts w:ascii="Times New Roman" w:cs="Times New Roman" w:eastAsia="Times New Roman" w:hAnsi="Times New Roman"/>
-                <w:sz w:val="24"/>
-                <w:szCs w:val="24"/>
-                <w:rtl w:val="0"/>
-              </w:rPr>
-              <w:t xml:space="preserve">{{itemQuantity}}</w:t>
-            </w:r>
-          </w:p>
-        </w:tc>
-        <w:tc>
-          <w:tcPr>
-            <w:tcBorders>
-              <w:top w:color="000000" w:space="0" w:sz="6" w:val="single"/>
-              <w:left w:color="000000" w:space="0" w:sz="6" w:val="single"/>
-              <w:bottom w:color="000000" w:space="0" w:sz="6" w:val="single"/>
-              <w:right w:color="000000" w:space="0" w:sz="6" w:val="single"/>
-            </w:tcBorders>
-            <w:shd w:fill="auto" w:val="clear"/>
-            <w:tcMar>
-              <w:top w:w="99.77952755905513" w:type="dxa"/>
-              <w:left w:w="99.77952755905513" w:type="dxa"/>
-              <w:bottom w:w="99.77952755905513" w:type="dxa"/>
-              <w:right w:w="99.77952755905513" w:type="dxa"/>
-            </w:tcMar>
-            <w:vAlign w:val="center"/>
-          </w:tcPr>
-          <w:p>
-            <w:pPr>
-              <w:widowControl w:val="0"/>
-              <w:spacing w:line="240" w:lineRule="auto"/>
-              <w:jc w:val="center"/>
-              <w:rPr>
-                <w:rFonts w:ascii="Times New Roman" w:cs="Times New Roman" w:eastAsia="Times New Roman" w:hAnsi="Times New Roman"/>
-                <w:sz w:val="24"/>
-                <w:szCs w:val="24"/>
-              </w:rPr>
-            </w:pPr>
-            <w:r>
-              <w:rPr>
-                <w:rFonts w:ascii="Times New Roman" w:cs="Times New Roman" w:eastAsia="Times New Roman" w:hAnsi="Times New Roman"/>
-                <w:sz w:val="24"/>
-                <w:szCs w:val="24"/>
-                <w:rtl w:val="0"/>
-              </w:rPr>
-              <w:t xml:space="preserve">{{itemUnit}}</w:t>
-            </w:r>
-          </w:p>
-        </w:tc>
-        <w:tc>
-          <w:tcPr>
-            <w:tcBorders>
-              <w:top w:color="000000" w:space="0" w:sz="6" w:val="single"/>
-              <w:left w:color="000000" w:space="0" w:sz="6" w:val="single"/>
-              <w:bottom w:color="000000" w:space="0" w:sz="6" w:val="single"/>
-              <w:right w:color="000000" w:space="0" w:sz="6" w:val="single"/>
-            </w:tcBorders>
-            <w:shd w:fill="auto" w:val="clear"/>
-            <w:tcMar>
-              <w:top w:w="99.77952755905513" w:type="dxa"/>
-              <w:left w:w="99.77952755905513" w:type="dxa"/>
-              <w:bottom w:w="99.77952755905513" w:type="dxa"/>
-              <w:right w:w="99.77952755905513" w:type="dxa"/>
-            </w:tcMar>
-            <w:vAlign w:val="center"/>
-          </w:tcPr>
-          <w:p>
-            <w:pPr>
-              <w:widowControl w:val="0"/>
-              <w:spacing w:line="240" w:lineRule="auto"/>
-              <w:jc w:val="center"/>
-              <w:rPr>
-                <w:rFonts w:ascii="Times New Roman" w:cs="Times New Roman" w:eastAsia="Times New Roman" w:hAnsi="Times New Roman"/>
-                <w:sz w:val="24"/>
-                <w:szCs w:val="24"/>
-              </w:rPr>
-            </w:pPr>
-            <w:r>
-              <w:rPr>
-                <w:rFonts w:ascii="Times New Roman" w:cs="Times New Roman" w:eastAsia="Times New Roman" w:hAnsi="Times New Roman"/>
-                <w:sz w:val="24"/>
-                <w:szCs w:val="24"/>
-                <w:rtl w:val="0"/>
-              </w:rPr>
-              <w:t xml:space="preserve">{{itemPrice}}</w:t>
-            </w:r>
-          </w:p>
-        </w:tc>
-        <w:tc>
-          <w:tcPr>
-            <w:tcBorders>
-              <w:top w:color="000000" w:space="0" w:sz="6" w:val="single"/>
-              <w:left w:color="000000" w:space="0" w:sz="6" w:val="single"/>
-              <w:bottom w:color="000000" w:space="0" w:sz="6" w:val="single"/>
-              <w:right w:color="000000" w:space="0" w:sz="6" w:val="single"/>
-            </w:tcBorders>
-            <w:shd w:fill="auto" w:val="clear"/>
-            <w:tcMar>
-              <w:top w:w="99.77952755905513" w:type="dxa"/>
-              <w:left w:w="99.77952755905513" w:type="dxa"/>
-              <w:bottom w:w="99.77952755905513" w:type="dxa"/>
-              <w:right w:w="99.77952755905513" w:type="dxa"/>
-            </w:tcMar>
-            <w:vAlign w:val="center"/>
-          </w:tcPr>
-          <w:p>
-            <w:pPr>
-              <w:widowControl w:val="0"/>
-              <w:spacing w:line="240" w:lineRule="auto"/>
-              <w:jc w:val="center"/>
-              <w:rPr>
-                <w:rFonts w:ascii="Times New Roman" w:cs="Times New Roman" w:eastAsia="Times New Roman" w:hAnsi="Times New Roman"/>
-                <w:sz w:val="24"/>
-                <w:szCs w:val="24"/>
-              </w:rPr>
-            </w:pPr>
-            <w:r>
-              <w:rPr>
-                <w:rFonts w:ascii="Times New Roman" w:cs="Times New Roman" w:eastAsia="Times New Roman" w:hAnsi="Times New Roman"/>
-                <w:sz w:val="24"/>
-                <w:szCs w:val="24"/>
-                <w:rtl w:val="0"/>
-              </w:rPr>
-              <w:t xml:space="preserve">{{itemTotal}}</w:t>
-            </w:r>
-          </w:p>
-        </w:tc>
-      </w:tr>
-      <!--items:2:end-->
-      <!--items:3:start-->
-      <w:tr>
-        <w:trPr>
-          <w:cantSplit w:val="0"/>
-          <w:tblHeader w:val="0"/>
-        </w:trPr>
-        <w:tc>
-          <w:tcPr>
-            <w:tcBorders>
-              <w:top w:color="000000" w:space="0" w:sz="6" w:val="single"/>
-              <w:left w:color="000000" w:space="0" w:sz="6" w:val="single"/>
-              <w:bottom w:color="000000" w:space="0" w:sz="6" w:val="single"/>
-              <w:right w:color="000000" w:space="0" w:sz="6" w:val="single"/>
-            </w:tcBorders>
-            <w:shd w:fill="auto" w:val="clear"/>
-            <w:tcMar>
-              <w:top w:w="99.77952755905513" w:type="dxa"/>
-              <w:left w:w="99.77952755905513" w:type="dxa"/>
-              <w:bottom w:w="99.77952755905513" w:type="dxa"/>
-              <w:right w:w="99.77952755905513" w:type="dxa"/>
-            </w:tcMar>
-          </w:tcPr>
-          <w:p>
-            <w:pPr>
-              <w:spacing w:line="240" w:lineRule="auto"/>
-              <w:jc w:val="center"/>
-              <w:rPr>
-                <w:rFonts w:ascii="Times New Roman" w:cs="Times New Roman" w:eastAsia="Times New Roman" w:hAnsi="Times New Roman"/>
-                <w:sz w:val="24"/>
-                <w:szCs w:val="24"/>
-              </w:rPr>
-            </w:pPr>
-            <w:r>
-              <w:rPr>
-                <w:rFonts w:ascii="Times New Roman" w:cs="Times New Roman" w:eastAsia="Times New Roman" w:hAnsi="Times New Roman"/>
-                <w:sz w:val="24"/>
-                <w:szCs w:val="24"/>
-                <w:rtl w:val="0"/>
-              </w:rPr>
-              <w:t xml:space="preserve">{{invoiceItemNumber}}</w:t>
-            </w:r>
-          </w:p>
-        </w:tc>
-        <w:tc>
-          <w:tcPr>
-            <w:tcBorders>
-              <w:top w:color="000000" w:space="0" w:sz="6" w:val="single"/>
-              <w:left w:color="000000" w:space="0" w:sz="6" w:val="single"/>
-              <w:bottom w:color="000000" w:space="0" w:sz="6" w:val="single"/>
-              <w:right w:color="000000" w:space="0" w:sz="6" w:val="single"/>
-            </w:tcBorders>
-            <w:shd w:fill="auto" w:val="clear"/>
-            <w:tcMar>
-              <w:top w:w="99.77952755905513" w:type="dxa"/>
-              <w:left w:w="99.77952755905513" w:type="dxa"/>
-              <w:bottom w:w="99.77952755905513" w:type="dxa"/>
-              <w:right w:w="99.77952755905513" w:type="dxa"/>
-            </w:tcMar>
-          </w:tcPr>
-          <w:p>
-            <w:pPr>
-              <w:spacing w:line="240" w:lineRule="auto"/>
-              <w:jc w:val="both"/>
-              <w:rPr>
-                <w:rFonts w:ascii="Times New Roman" w:cs="Times New Roman" w:eastAsia="Times New Roman" w:hAnsi="Times New Roman"/>
-                <w:sz w:val="24"/>
-                <w:szCs w:val="24"/>
-              </w:rPr>
-            </w:pPr>
-            <w:r>
-              <w:rPr>
-                <w:rFonts w:ascii="Times New Roman" w:cs="Times New Roman" w:eastAsia="Times New Roman" w:hAnsi="Times New Roman"/>
-                <w:sz w:val="24"/>
-                <w:szCs w:val="24"/>
-                <w:rtl w:val="0"/>
-              </w:rPr>
-              <w:t xml:space="preserve">{{itemName}}</w:t>
-            </w:r>
-          </w:p>
-        </w:tc>
-        <w:tc>
-          <w:tcPr>
-            <w:tcBorders>
-              <w:top w:color="000000" w:space="0" w:sz="6" w:val="single"/>
-              <w:left w:color="000000" w:space="0" w:sz="6" w:val="single"/>
-              <w:bottom w:color="000000" w:space="0" w:sz="6" w:val="single"/>
-              <w:right w:color="000000" w:space="0" w:sz="6" w:val="single"/>
-            </w:tcBorders>
-            <w:shd w:fill="auto" w:val="clear"/>
-            <w:tcMar>
-              <w:top w:w="99.77952755905513" w:type="dxa"/>
-              <w:left w:w="99.77952755905513" w:type="dxa"/>
-              <w:bottom w:w="99.77952755905513" w:type="dxa"/>
-              <w:right w:w="99.77952755905513" w:type="dxa"/>
-            </w:tcMar>
-            <w:vAlign w:val="center"/>
-          </w:tcPr>
-          <w:p>
-            <w:pPr>
-              <w:spacing w:line="240" w:lineRule="auto"/>
-              <w:jc w:val="center"/>
-              <w:rPr>
-                <w:rFonts w:ascii="Times New Roman" w:cs="Times New Roman" w:eastAsia="Times New Roman" w:hAnsi="Times New Roman"/>
-                <w:sz w:val="24"/>
-                <w:szCs w:val="24"/>
-              </w:rPr>
-            </w:pPr>
-            <w:r>
-              <w:rPr>
-                <w:rFonts w:ascii="Times New Roman" w:cs="Times New Roman" w:eastAsia="Times New Roman" w:hAnsi="Times New Roman"/>
-                <w:sz w:val="24"/>
-                <w:szCs w:val="24"/>
-                <w:rtl w:val="0"/>
-              </w:rPr>
-              <w:t xml:space="preserve">{{itemQuantity}}</w:t>
-            </w:r>
-          </w:p>
-        </w:tc>
-        <w:tc>
-          <w:tcPr>
-            <w:tcBorders>
-              <w:top w:color="000000" w:space="0" w:sz="6" w:val="single"/>
-              <w:left w:color="000000" w:space="0" w:sz="6" w:val="single"/>
-              <w:bottom w:color="000000" w:space="0" w:sz="6" w:val="single"/>
-              <w:right w:color="000000" w:space="0" w:sz="6" w:val="single"/>
-            </w:tcBorders>
-            <w:shd w:fill="auto" w:val="clear"/>
-            <w:tcMar>
-              <w:top w:w="99.77952755905513" w:type="dxa"/>
-              <w:left w:w="99.77952755905513" w:type="dxa"/>
-              <w:bottom w:w="99.77952755905513" w:type="dxa"/>
-              <w:right w:w="99.77952755905513" w:type="dxa"/>
-            </w:tcMar>
-            <w:vAlign w:val="center"/>
-          </w:tcPr>
-          <w:p>
-            <w:pPr>
-              <w:widowControl w:val="0"/>
-              <w:spacing w:line="240" w:lineRule="auto"/>
-              <w:jc w:val="center"/>
-              <w:rPr>
-                <w:rFonts w:ascii="Times New Roman" w:cs="Times New Roman" w:eastAsia="Times New Roman" w:hAnsi="Times New Roman"/>
-                <w:sz w:val="24"/>
-                <w:szCs w:val="24"/>
-              </w:rPr>
-            </w:pPr>
-            <w:r>
-              <w:rPr>
-                <w:rFonts w:ascii="Times New Roman" w:cs="Times New Roman" w:eastAsia="Times New Roman" w:hAnsi="Times New Roman"/>
-                <w:sz w:val="24"/>
-                <w:szCs w:val="24"/>
-                <w:rtl w:val="0"/>
-              </w:rPr>
-              <w:t xml:space="preserve">{{itemUnit}}</w:t>
-            </w:r>
-          </w:p>
-        </w:tc>
-        <w:tc>
-          <w:tcPr>
-            <w:tcBorders>
-              <w:top w:color="000000" w:space="0" w:sz="6" w:val="single"/>
-              <w:left w:color="000000" w:space="0" w:sz="6" w:val="single"/>
-              <w:bottom w:color="000000" w:space="0" w:sz="6" w:val="single"/>
-              <w:right w:color="000000" w:space="0" w:sz="6" w:val="single"/>
-            </w:tcBorders>
-            <w:shd w:fill="auto" w:val="clear"/>
-            <w:tcMar>
-              <w:top w:w="99.77952755905513" w:type="dxa"/>
-              <w:left w:w="99.77952755905513" w:type="dxa"/>
-              <w:bottom w:w="99.77952755905513" w:type="dxa"/>
-              <w:right w:w="99.77952755905513" w:type="dxa"/>
-            </w:tcMar>
-            <w:vAlign w:val="center"/>
-          </w:tcPr>
-          <w:p>
-            <w:pPr>
-              <w:widowControl w:val="0"/>
-              <w:spacing w:line="240" w:lineRule="auto"/>
-              <w:jc w:val="center"/>
-              <w:rPr>
-                <w:rFonts w:ascii="Times New Roman" w:cs="Times New Roman" w:eastAsia="Times New Roman" w:hAnsi="Times New Roman"/>
-                <w:sz w:val="24"/>
-                <w:szCs w:val="24"/>
-              </w:rPr>
-            </w:pPr>
-            <w:r>
-              <w:rPr>
-                <w:rFonts w:ascii="Times New Roman" w:cs="Times New Roman" w:eastAsia="Times New Roman" w:hAnsi="Times New Roman"/>
-                <w:sz w:val="24"/>
-                <w:szCs w:val="24"/>
-                <w:rtl w:val="0"/>
-              </w:rPr>
-              <w:t xml:space="preserve">{{itemPrice}}</w:t>
-            </w:r>
-          </w:p>
-        </w:tc>
-        <w:tc>
-          <w:tcPr>
-            <w:tcBorders>
-              <w:top w:color="000000" w:space="0" w:sz="6" w:val="single"/>
-              <w:left w:color="000000" w:space="0" w:sz="6" w:val="single"/>
-              <w:bottom w:color="000000" w:space="0" w:sz="6" w:val="single"/>
-              <w:right w:color="000000" w:space="0" w:sz="6" w:val="single"/>
-            </w:tcBorders>
-            <w:shd w:fill="auto" w:val="clear"/>
-            <w:tcMar>
-              <w:top w:w="99.77952755905513" w:type="dxa"/>
-              <w:left w:w="99.77952755905513" w:type="dxa"/>
-              <w:bottom w:w="99.77952755905513" w:type="dxa"/>
-              <w:right w:w="99.77952755905513" w:type="dxa"/>
-            </w:tcMar>
-            <w:vAlign w:val="center"/>
-          </w:tcPr>
-          <w:p>
-            <w:pPr>
-              <w:widowControl w:val="0"/>
-              <w:spacing w:line="240" w:lineRule="auto"/>
-              <w:jc w:val="center"/>
-              <w:rPr>
-                <w:rFonts w:ascii="Times New Roman" w:cs="Times New Roman" w:eastAsia="Times New Roman" w:hAnsi="Times New Roman"/>
-                <w:sz w:val="24"/>
-                <w:szCs w:val="24"/>
-              </w:rPr>
-            </w:pPr>
-            <w:r>
-              <w:rPr>
-                <w:rFonts w:ascii="Times New Roman" w:cs="Times New Roman" w:eastAsia="Times New Roman" w:hAnsi="Times New Roman"/>
-                <w:sz w:val="24"/>
-                <w:szCs w:val="24"/>
-                <w:rtl w:val="0"/>
-              </w:rPr>
-              <w:t xml:space="preserve">{{itemTotal}}</w:t>
-            </w:r>
-          </w:p>
-        </w:tc>
-      </w:tr>
-      <!--items:3:end-->
-      <w:tr>
-        <w:trPr>
-          <w:cantSplit w:val="0"/>
-          <w:tblHeader w:val="0"/>
-        </w:trPr>
-        <w:tc>
-          <w:tcPr>
-            <w:tcBorders>
-              <w:bottom w:color="000000" w:space="0" w:sz="6" w:val="single"/>
+              <w:bottom w:color="000000" w:space="0" w:sz="4" w:val="single"/>
             </w:tcBorders>
             <w:shd w:fill="auto" w:val="clear"/>
             <w:tcMar>
@@ -1722,8 +1022,146 @@
           </w:tcPr>
           <w:p>
             <w:pPr>
+              <w:widowControl w:val="0"/>
+              <w:spacing w:line="240" w:lineRule="auto"/>
+              <w:jc w:val="right"/>
+              <w:rPr>
+                <w:rFonts w:ascii="Times New Roman" w:cs="Times New Roman" w:eastAsia="Times New Roman" w:hAnsi="Times New Roman"/>
+                <w:b w:val="1"/>
+                <w:bCs w:val="1"/>
+                <w:sz w:val="24"/>
+                <w:szCs w:val="24"/>
+              </w:rPr>
+            </w:pPr>
+            <w:r>
+              <w:rPr>
+                <w:rFonts w:ascii="Times New Roman" w:cs="Times New Roman" w:eastAsia="Times New Roman" w:hAnsi="Times New Roman"/>
+                <w:b w:val="1"/>
+                <w:bCs w:val="1"/>
+                <w:sz w:val="24"/>
+                <w:szCs w:val="24"/>
+                <w:rtl w:val="0"/>
+              </w:rPr>
+              <w:t xml:space="preserve">ИТОГО:</w:t>
+            </w:r>
+          </w:p>
+        </w:tc>
+        <w:tc>
+          <w:tcPr>
+            <w:tcBorders>
+              <w:bottom w:color="000000" w:space="0" w:sz="4" w:val="single"/>
+            </w:tcBorders>
+            <w:shd w:fill="auto" w:val="clear"/>
+            <w:tcMar>
+              <w:top w:w="100.0" w:type="dxa"/>
+              <w:left w:w="100.0" w:type="dxa"/>
+              <w:bottom w:w="100.0" w:type="dxa"/>
+              <w:right w:w="100.0" w:type="dxa"/>
+            </w:tcMar>
+            <w:vAlign w:val="top"/>
+          </w:tcPr>
+          <w:p>
+            <w:pPr>
+              <w:widowControl w:val="0"/>
+              <w:spacing w:line="240" w:lineRule="auto"/>
+              <w:jc w:val="right"/>
+              <w:rPr>
+                <w:rFonts w:ascii="Times New Roman" w:cs="Times New Roman" w:eastAsia="Times New Roman" w:hAnsi="Times New Roman"/>
+                <w:sz w:val="26"/>
+                <w:szCs w:val="26"/>
+              </w:rPr>
+            </w:pPr>
+            <w:r>
+              <w:rPr>
+                <w:rFonts w:ascii="Times New Roman" w:cs="Times New Roman" w:eastAsia="Times New Roman" w:hAnsi="Times New Roman"/>
+                <w:b w:val="1"/>
+                <w:bCs w:val="1"/>
+                <w:sz w:val="24"/>
+                <w:szCs w:val="24"/>
+                <w:rtl w:val="0"/>
+              </w:rPr>
+              <w:t xml:space="preserve">{{total}}</w:t>
+            </w:r>
+            <w:r>
+              <w:rPr>
+                <w:rtl w:val="0"/>
+              </w:rPr>
+            </w:r>
+          </w:p>
+        </w:tc>
+      </w:tr>
+      <w:tr>
+        <w:trPr>
+          <w:cantSplit w:val="0"/>
+          <w:trHeight w:val="440" w:hRule="atLeast"/>
+          <w:tblHeader w:val="0"/>
+        </w:trPr>
+        <w:tc>
+          <w:tcPr>
+            <w:gridSpan w:val="5"/>
+            <w:tcBorders>
+              <w:top w:color="000000" w:space="0" w:sz="4" w:val="single"/>
+              <w:left w:color="000000" w:space="0" w:sz="0" w:val="nil"/>
+              <w:bottom w:color="000000" w:space="0" w:sz="0" w:val="nil"/>
+              <w:right w:color="000000" w:space="0" w:sz="0" w:val="nil"/>
+            </w:tcBorders>
+            <w:shd w:fill="auto" w:val="clear"/>
+            <w:tcMar>
+              <w:top w:w="100.0" w:type="dxa"/>
+              <w:left w:w="100.0" w:type="dxa"/>
+              <w:bottom w:w="100.0" w:type="dxa"/>
+              <w:right w:w="100.0" w:type="dxa"/>
+            </w:tcMar>
+            <w:vAlign w:val="top"/>
+          </w:tcPr>
+          <w:p>
+            <w:pPr>
+              <w:widowControl w:val="0"/>
+              <w:spacing w:line="240" w:lineRule="auto"/>
+              <w:jc w:val="right"/>
+              <w:rPr>
+                <w:rFonts w:ascii="Times New Roman" w:cs="Times New Roman" w:eastAsia="Times New Roman" w:hAnsi="Times New Roman"/>
+                <w:b w:val="1"/>
+                <w:bCs w:val="1"/>
+                <w:sz w:val="24"/>
+                <w:szCs w:val="24"/>
+              </w:rPr>
+            </w:pPr>
+            <w:r>
+              <w:rPr>
+                <w:rFonts w:ascii="Times New Roman" w:cs="Times New Roman" w:eastAsia="Times New Roman" w:hAnsi="Times New Roman"/>
+                <w:b w:val="1"/>
+                <w:bCs w:val="1"/>
+                <w:sz w:val="24"/>
+                <w:szCs w:val="24"/>
+                <w:rtl w:val="0"/>
+              </w:rPr>
+              <w:t xml:space="preserve">ИТОГО:</w:t>
+            </w:r>
+          </w:p>
+        </w:tc>
+        <w:tc>
+          <w:tcPr>
+            <w:tcBorders>
+              <w:top w:color="000000" w:space="0" w:sz="4" w:val="single"/>
+              <w:left w:color="000000" w:space="0" w:sz="0" w:val="nil"/>
+              <w:bottom w:color="000000" w:space="0" w:sz="0" w:val="nil"/>
+              <w:right w:color="000000" w:space="0" w:sz="0" w:val="nil"/>
+            </w:tcBorders>
+            <w:shd w:fill="auto" w:val="clear"/>
+            <w:tcMar>
+              <w:top w:w="100.0" w:type="dxa"/>
+              <w:left w:w="100.0" w:type="dxa"/>
+              <w:bottom w:w="100.0" w:type="dxa"/>
+              <w:right w:w="100.0" w:type="dxa"/>
+            </w:tcMar>
+            <w:vAlign w:val="top"/>
+          </w:tcPr>
+          <w:p>
+            <w:pPr>
               <w:keepNext w:val="0"/>
               <w:keepLines w:val="0"/>
+              <w:pageBreakBefore w:val="0"/>
               <w:widowControl w:val="0"/>
               <w:pBdr>
                 <w:top w:space="0" w:sz="0" w:val="nil"/>
@@ -1735,101 +1173,21 @@
               <w:shd w:fill="auto" w:val="clear"/>
               <w:spacing w:after="0" w:before="0" w:line="240" w:lineRule="auto"/>
               <w:ind w:left="0" w:right="0" w:firstLine="0"/>
-              <w:jc w:val="center"/>
-              <w:rPr>
-                <w:rFonts w:ascii="Times New Roman" w:cs="Times New Roman" w:eastAsia="Times New Roman" w:hAnsi="Times New Roman"/>
-                <w:sz w:val="24"/>
-                <w:szCs w:val="24"/>
-              </w:rPr>
-            </w:pPr>
-            <w:r>
-              <w:rPr>
-                <w:rtl w:val="0"/>
-              </w:rPr>
-            </w:r>
-          </w:p>
-        </w:tc>
-        <w:tc>
-          <w:tcPr>
-            <w:gridSpan w:val="4"/>
-            <w:tcBorders>
-              <w:bottom w:color="000000" w:space="0" w:sz="6" w:val="single"/>
-            </w:tcBorders>
-            <w:shd w:fill="auto" w:val="clear"/>
-            <w:tcMar>
-              <w:top w:w="100.0" w:type="dxa"/>
-              <w:left w:w="100.0" w:type="dxa"/>
-              <w:bottom w:w="100.0" w:type="dxa"/>
-              <w:right w:w="100.0" w:type="dxa"/>
-            </w:tcMar>
-            <w:vAlign w:val="top"/>
-          </w:tcPr>
-          <w:p>
-            <w:pPr>
-              <w:widowControl w:val="0"/>
-              <w:spacing w:line="240" w:lineRule="auto"/>
               <w:jc w:val="right"/>
               <w:rPr>
                 <w:rFonts w:ascii="Times New Roman" w:cs="Times New Roman" w:eastAsia="Times New Roman" w:hAnsi="Times New Roman"/>
-                <w:b w:val="1"/>
-                <w:bCs w:val="1"/>
-                <w:sz w:val="24"/>
-                <w:szCs w:val="24"/>
-              </w:rPr>
-            </w:pPr>
-            <w:r>
-              <w:rPr>
-                <w:rFonts w:ascii="Times New Roman" w:cs="Times New Roman" w:eastAsia="Times New Roman" w:hAnsi="Times New Roman"/>
-                <w:b w:val="1"/>
-                <w:bCs w:val="1"/>
-                <w:sz w:val="24"/>
-                <w:szCs w:val="24"/>
-                <w:rtl w:val="0"/>
-              </w:rPr>
-              <w:t xml:space="preserve">ИТОГО:</w:t>
-            </w:r>
-          </w:p>
-        </w:tc>
-        <w:tc>
-          <w:tcPr>
-            <w:tcBorders>
-              <w:bottom w:color="000000" w:space="0" w:sz="6" w:val="single"/>
-            </w:tcBorders>
-            <w:shd w:fill="auto" w:val="clear"/>
-            <w:tcMar>
-              <w:top w:w="100.0" w:type="dxa"/>
-              <w:left w:w="100.0" w:type="dxa"/>
-              <w:bottom w:w="100.0" w:type="dxa"/>
-              <w:right w:w="100.0" w:type="dxa"/>
-            </w:tcMar>
-            <w:vAlign w:val="top"/>
-          </w:tcPr>
-          <w:p>
-            <w:pPr>
-              <w:widowControl w:val="0"/>
-              <w:spacing w:line="240" w:lineRule="auto"/>
-              <w:jc w:val="center"/>
-              <w:rPr>
-                <w:rFonts w:ascii="Times New Roman" w:cs="Times New Roman" w:eastAsia="Times New Roman" w:hAnsi="Times New Roman"/>
-                <w:sz w:val="26"/>
-                <w:szCs w:val="26"/>
-              </w:rPr>
-            </w:pPr>
-            <w:r>
-              <w:rPr>
-                <w:rFonts w:ascii="Times New Roman" w:cs="Times New Roman" w:eastAsia="Times New Roman" w:hAnsi="Times New Roman"/>
-                <w:b w:val="1"/>
-                <w:bCs w:val="1"/>
+                <w:sz w:val="24"/>
+                <w:szCs w:val="24"/>
+              </w:rPr>
+            </w:pPr>
+            <w:r>
+              <w:rPr>
+                <w:rFonts w:ascii="Times New Roman" w:cs="Times New Roman" w:eastAsia="Times New Roman" w:hAnsi="Times New Roman"/>
                 <w:sz w:val="24"/>
                 <w:szCs w:val="24"/>
                 <w:rtl w:val="0"/>
               </w:rPr>
               <w:t xml:space="preserve">{{total}}</w:t>
-            </w:r>
-            <w:r>
-              <w:rPr>
-                <w:rtl w:val="0"/>
-              </w:rPr>
             </w:r>
           </w:p>
         </w:tc>
@@ -1844,7 +1202,7 @@
           <w:tcPr>
             <w:gridSpan w:val="5"/>
             <w:tcBorders>
-              <w:top w:color="000000" w:space="0" w:sz="4" w:val="single"/>
+              <w:top w:color="000000" w:space="0" w:sz="0" w:val="nil"/>
               <w:left w:color="000000" w:space="0" w:sz="0" w:val="nil"/>
               <w:bottom w:color="000000" w:space="0" w:sz="0" w:val="nil"/>
               <w:right w:color="000000" w:space="0" w:sz="0" w:val="nil"/>
@@ -1880,14 +1238,14 @@
                 <w:szCs w:val="24"/>
                 <w:rtl w:val="0"/>
               </w:rPr>
-              <w:t xml:space="preserve">ИТОГО:</w:t>
+              <w:t xml:space="preserve">{{invoiceVatLabel}}</w:t>
             </w:r>
           </w:p>
         </w:tc>
         <w:tc>
           <w:tcPr>
             <w:tcBorders>
-              <w:top w:color="000000" w:space="0" w:sz="4" w:val="single"/>
+              <w:top w:color="000000" w:space="0" w:sz="0" w:val="nil"/>
               <w:left w:color="000000" w:space="0" w:sz="0" w:val="nil"/>
               <w:bottom w:color="000000" w:space="0" w:sz="0" w:val="nil"/>
               <w:right w:color="000000" w:space="0" w:sz="0" w:val="nil"/>
@@ -1905,6 +1263,7 @@
             <w:pPr>
               <w:keepNext w:val="0"/>
               <w:keepLines w:val="0"/>
+              <w:pageBreakBefore w:val="0"/>
               <w:widowControl w:val="0"/>
               <w:pBdr>
                 <w:top w:space="0" w:sz="0" w:val="nil"/>
@@ -1916,21 +1275,21 @@
               <w:shd w:fill="auto" w:val="clear"/>
               <w:spacing w:after="0" w:before="0" w:line="240" w:lineRule="auto"/>
               <w:ind w:left="0" w:right="0" w:firstLine="0"/>
-              <w:jc w:val="center"/>
-              <w:rPr>
-                <w:rFonts w:ascii="Times New Roman" w:cs="Times New Roman" w:eastAsia="Times New Roman" w:hAnsi="Times New Roman"/>
-                <w:sz w:val="24"/>
-                <w:szCs w:val="24"/>
-              </w:rPr>
-            </w:pPr>
-            <w:r>
-              <w:rPr>
-                <w:rFonts w:ascii="Times New Roman" w:cs="Times New Roman" w:eastAsia="Times New Roman" w:hAnsi="Times New Roman"/>
-                <w:sz w:val="24"/>
-                <w:szCs w:val="24"/>
-                <w:rtl w:val="0"/>
-              </w:rPr>
-              <w:t xml:space="preserve">{{total}}</w:t>
+              <w:jc w:val="right"/>
+              <w:rPr>
+                <w:rFonts w:ascii="Times New Roman" w:cs="Times New Roman" w:eastAsia="Times New Roman" w:hAnsi="Times New Roman"/>
+                <w:sz w:val="24"/>
+                <w:szCs w:val="24"/>
+              </w:rPr>
+            </w:pPr>
+            <w:r>
+              <w:rPr>
+                <w:rFonts w:ascii="Times New Roman" w:cs="Times New Roman" w:eastAsia="Times New Roman" w:hAnsi="Times New Roman"/>
+                <w:sz w:val="24"/>
+                <w:szCs w:val="24"/>
+                <w:rtl w:val="0"/>
+              </w:rPr>
+              <w:t xml:space="preserve">{{invoiceVat}}</w:t>
             </w:r>
           </w:p>
         </w:tc>
@@ -1981,7 +1340,7 @@
                 <w:szCs w:val="24"/>
                 <w:rtl w:val="0"/>
               </w:rPr>
-              <w:t xml:space="preserve">{{invoiceVatLabel}}</w:t>
+              <w:t xml:space="preserve">Bсего к оплате:</w:t>
             </w:r>
           </w:p>
         </w:tc>
@@ -2004,121 +1363,9 @@
           </w:tcPr>
           <w:p>
             <w:pPr>
-              <w:keepNext w:val="0"/>
-              <w:keepLines w:val="0"/>
-              <w:widowControl w:val="0"/>
-              <w:pBdr>
-                <w:top w:space="0" w:sz="0" w:val="nil"/>
-                <w:left w:space="0" w:sz="0" w:val="nil"/>
-                <w:bottom w:space="0" w:sz="0" w:val="nil"/>
-                <w:right w:space="0" w:sz="0" w:val="nil"/>
-                <w:between w:space="0" w:sz="0" w:val="nil"/>
-              </w:pBdr>
-              <w:shd w:fill="auto" w:val="clear"/>
-              <w:spacing w:after="0" w:before="0" w:line="240" w:lineRule="auto"/>
-              <w:ind w:left="0" w:right="0" w:firstLine="0"/>
-              <w:jc w:val="center"/>
-              <w:rPr>
-                <w:rFonts w:ascii="Times New Roman" w:cs="Times New Roman" w:eastAsia="Times New Roman" w:hAnsi="Times New Roman"/>
-                <w:sz w:val="24"/>
-                <w:szCs w:val="24"/>
-              </w:rPr>
-            </w:pPr>
-            <w:r>
-              <w:rPr>
-                <w:rFonts w:ascii="Times New Roman" w:cs="Times New Roman" w:eastAsia="Times New Roman" w:hAnsi="Times New Roman"/>
-                <w:sz w:val="24"/>
-                <w:szCs w:val="24"/>
-                <w:rtl w:val="0"/>
-              </w:rPr>
-              <w:t xml:space="preserve">{{invoiceVat}}</w:t>
-            </w:r>
-          </w:p>
-        </w:tc>
-      </w:tr>
-      <w:tr>
-        <w:trPr>
-          <w:cantSplit w:val="0"/>
-          <w:trHeight w:val="440" w:hRule="atLeast"/>
-          <w:tblHeader w:val="0"/>
-        </w:trPr>
-        <w:tc>
-          <w:tcPr>
-            <w:gridSpan w:val="5"/>
-            <w:tcBorders>
-              <w:top w:color="000000" w:space="0" w:sz="0" w:val="nil"/>
-              <w:left w:color="000000" w:space="0" w:sz="0" w:val="nil"/>
-              <w:bottom w:color="000000" w:space="0" w:sz="0" w:val="nil"/>
-              <w:right w:color="000000" w:space="0" w:sz="0" w:val="nil"/>
-            </w:tcBorders>
-            <w:shd w:fill="auto" w:val="clear"/>
-            <w:tcMar>
-              <w:top w:w="100.0" w:type="dxa"/>
-              <w:left w:w="100.0" w:type="dxa"/>
-              <w:bottom w:w="100.0" w:type="dxa"/>
-              <w:right w:w="100.0" w:type="dxa"/>
-            </w:tcMar>
-            <w:vAlign w:val="top"/>
-          </w:tcPr>
-          <w:p>
-            <w:pPr>
               <w:widowControl w:val="0"/>
               <w:spacing w:line="240" w:lineRule="auto"/>
               <w:jc w:val="right"/>
-              <w:rPr>
-                <w:rFonts w:ascii="Times New Roman" w:cs="Times New Roman" w:eastAsia="Times New Roman" w:hAnsi="Times New Roman"/>
-                <w:b w:val="1"/>
-                <w:bCs w:val="1"/>
-                <w:sz w:val="24"/>
-                <w:szCs w:val="24"/>
-              </w:rPr>
-            </w:pPr>
-            <w:r>
-              <w:rPr>
-                <w:rFonts w:ascii="Times New Roman" w:cs="Times New Roman" w:eastAsia="Times New Roman" w:hAnsi="Times New Roman"/>
-                <w:b w:val="1"/>
-                <w:bCs w:val="1"/>
-                <w:sz w:val="24"/>
-                <w:szCs w:val="24"/>
-                <w:rtl w:val="0"/>
-              </w:rPr>
-              <w:t xml:space="preserve">Bсего к оплате:</w:t>
-            </w:r>
-          </w:p>
-        </w:tc>
-        <w:tc>
-          <w:tcPr>
-            <w:tcBorders>
-              <w:top w:color="000000" w:space="0" w:sz="0" w:val="nil"/>
-              <w:left w:color="000000" w:space="0" w:sz="0" w:val="nil"/>
-              <w:bottom w:color="000000" w:space="0" w:sz="0" w:val="nil"/>
-              <w:right w:color="000000" w:space="0" w:sz="0" w:val="nil"/>
-            </w:tcBorders>
-            <w:shd w:fill="auto" w:val="clear"/>
-            <w:tcMar>
-              <w:top w:w="100.0" w:type="dxa"/>
-              <w:left w:w="100.0" w:type="dxa"/>
-              <w:bottom w:w="100.0" w:type="dxa"/>
-              <w:right w:w="100.0" w:type="dxa"/>
-            </w:tcMar>
-            <w:vAlign w:val="top"/>
-          </w:tcPr>
-          <w:p>
-            <w:pPr>
-              <w:keepNext w:val="0"/>
-              <w:keepLines w:val="0"/>
-              <w:widowControl w:val="0"/>
-              <w:pBdr>
-                <w:top w:space="0" w:sz="0" w:val="nil"/>
-                <w:left w:space="0" w:sz="0" w:val="nil"/>
-                <w:bottom w:space="0" w:sz="0" w:val="nil"/>
-                <w:right w:space="0" w:sz="0" w:val="nil"/>
-                <w:between w:space="0" w:sz="0" w:val="nil"/>
-              </w:pBdr>
-              <w:shd w:fill="auto" w:val="clear"/>
-              <w:spacing w:after="0" w:before="0" w:line="240" w:lineRule="auto"/>
-              <w:ind w:left="0" w:right="0" w:firstLine="0"/>
-              <w:jc w:val="center"/>
               <w:rPr>
                 <w:rFonts w:ascii="Times New Roman" w:cs="Times New Roman" w:eastAsia="Times New Roman" w:hAnsi="Times New Roman"/>
                 <w:sz w:val="24"/>
@@ -2155,9 +1402,14 @@
         </w:rPr>
         <w:t xml:space="preserve">{{invoiceCount}}</w:t>
       </w:r>
+      <w:r/>
+      <w:r/>
     </w:p>
     <w:p>
       <w:pPr>
+        <w:spacing w:line="240" w:lineRule="auto"/>
+        <w:ind w:left="0" w:firstLine="0"/>
+        <w:jc w:val="both"/>
         <w:rPr>
           <w:rFonts w:ascii="Times New Roman" w:cs="Times New Roman" w:eastAsia="Times New Roman" w:hAnsi="Times New Roman"/>
           <w:sz w:val="24"/>
@@ -2243,20 +1495,8 @@
           </w:tcPr>
           <w:p>
             <w:pPr>
-              <w:keepNext w:val="0"/>
-              <w:keepLines w:val="0"/>
               <w:widowControl w:val="0"/>
-              <w:pBdr>
-                <w:top w:space="0" w:sz="0" w:val="nil"/>
-                <w:left w:space="0" w:sz="0" w:val="nil"/>
-                <w:bottom w:space="0" w:sz="0" w:val="nil"/>
-                <w:right w:space="0" w:sz="0" w:val="nil"/>
-                <w:between w:space="0" w:sz="0" w:val="nil"/>
-              </w:pBdr>
-              <w:shd w:fill="auto" w:val="clear"/>
-              <w:spacing w:after="0" w:before="0" w:line="240" w:lineRule="auto"/>
-              <w:ind w:left="0" w:right="0" w:firstLine="0"/>
-              <w:jc w:val="left"/>
+              <w:spacing w:line="240" w:lineRule="auto"/>
               <w:rPr>
                 <w:rFonts w:ascii="Times New Roman" w:cs="Times New Roman" w:eastAsia="Times New Roman" w:hAnsi="Times New Roman"/>
                 <w:sz w:val="24"/>
@@ -2293,19 +1533,8 @@
           </w:tcPr>
           <w:p>
             <w:pPr>
-              <w:keepNext w:val="0"/>
-              <w:keepLines w:val="0"/>
               <w:widowControl w:val="0"/>
-              <w:pBdr>
-                <w:top w:space="0" w:sz="0" w:val="nil"/>
-                <w:left w:space="0" w:sz="0" w:val="nil"/>
-                <w:bottom w:space="0" w:sz="0" w:val="nil"/>
-                <w:right w:space="0" w:sz="0" w:val="nil"/>
-                <w:between w:space="0" w:sz="0" w:val="nil"/>
-              </w:pBdr>
-              <w:shd w:fill="auto" w:val="clear"/>
-              <w:spacing w:after="0" w:before="0" w:line="240" w:lineRule="auto"/>
-              <w:ind w:left="0" w:right="0" w:firstLine="0"/>
+              <w:spacing w:line="240" w:lineRule="auto"/>
               <w:jc w:val="right"/>
               <w:rPr>
                 <w:rFonts w:ascii="Times New Roman" w:cs="Times New Roman" w:eastAsia="Times New Roman" w:hAnsi="Times New Roman"/>
@@ -2328,6 +1557,7 @@
     </w:tbl>
     <w:p>
       <w:pPr>
+        <w:spacing w:line="276" w:lineRule="auto"/>
         <w:rPr>
           <w:rFonts w:ascii="Times New Roman" w:cs="Times New Roman" w:eastAsia="Times New Roman" w:hAnsi="Times New Roman"/>
           <w:sz w:val="24"/>
@@ -2341,9 +1571,9 @@
       </w:r>
     </w:p>
     <w:sectPr>
-      <w:headerReference r:id="rId6" w:type="default"/>
-      <w:headerReference r:id="rId7" w:type="first"/>
-      <w:footerReference r:id="rId8" w:type="first"/>
+      <w:headerReference r:id="rId8" w:type="default"/>
+      <w:headerReference r:id="rId9" w:type="first"/>
+      <w:footerReference r:id="rId10" w:type="first"/>
       <w:pgSz w:h="16838" w:w="11906" w:orient="portrait"/>
       <w:pgMar w:bottom="850.3937007874016" w:top="708.6614173228347" w:left="708.6614173228347" w:right="708.6614173228347" w:header="720" w:footer="720"/>
       <w:pgNumType w:start="1"/>
@@ -2391,6 +1621,7 @@
 <w:hdr xmlns:mc="http://schemas.openxmlformats.org/markup-compatibility/2006" xmlns:o="urn:schemas-microsoft-com:office:office" xmlns:r="http://schemas.openxmlformats.org/officeDocument/2006/relationships" xmlns:m="http://schemas.openxmlformats.org/officeDocument/2006/math" xmlns:v="urn:schemas-microsoft-com:vml" xmlns:wp="http://schemas.openxmlformats.org/drawingml/2006/wordprocessingDrawing" xmlns:w10="urn:schemas-microsoft-com:office:word" xmlns:w="http://schemas.openxmlformats.org/wordprocessingml/2006/main" xmlns:wne="http://schemas.microsoft.com/office/word/2006/wordml" xmlns:sl="http://schemas.openxmlformats.org/schemaLibrary/2006/main" xmlns:a="http://schemas.openxmlformats.org/drawingml/2006/main" xmlns:pic="http://schemas.openxmlformats.org/drawingml/2006/picture" xmlns:c="http://schemas.openxmlformats.org/drawingml/2006/chart" xmlns:lc="http://schemas.openxmlformats.org/drawingml/2006/lockedCanvas" xmlns:dgm="http://schemas.openxmlformats.org/drawingml/2006/diagram" xmlns:wps="http://schemas.microsoft.com/office/word/2010/wordprocessingShape" xmlns:wpg="http://schemas.microsoft.com/office/word/2010/wordprocessingGroup" xmlns:w14="http://schemas.microsoft.com/office/word/2010/wordml" xmlns:w15="http://schemas.microsoft.com/office/word/2012/wordml" xmlns:w16="http://schemas.microsoft.com/office/word/2018/wordml" xmlns:w16cex="http://schemas.microsoft.com/office/word/2018/wordml/cex" xmlns:w16cid="http://schemas.microsoft.com/office/word/2016/wordml/cid" xmlns="http://schemas.microsoft.com/office/tasks/2019/documenttasks" xmlns:cr="http://schemas.microsoft.com/office/comments/2020/reactions">
   <w:p>
     <w:pPr>
+      <w:spacing w:line="276" w:lineRule="auto"/>
       <w:rPr>
         <w:rFonts w:ascii="Times New Roman" w:cs="Times New Roman" w:eastAsia="Times New Roman" w:hAnsi="Times New Roman"/>
         <w:sz w:val="24"/>
@@ -2585,21 +1816,7 @@
         </w:tcPr>
         <w:p>
           <w:pPr>
-            <w:keepNext w:val="0"/>
-            <w:keepLines w:val="0"/>
-            <w:pageBreakBefore w:val="0"/>
             <w:widowControl w:val="0"/>
-            <w:pBdr>
-              <w:top w:space="0" w:sz="0" w:val="nil"/>
-              <w:left w:space="0" w:sz="0" w:val="nil"/>
-              <w:bottom w:space="0" w:sz="0" w:val="nil"/>
-              <w:right w:space="0" w:sz="0" w:val="nil"/>
-              <w:between w:space="0" w:sz="0" w:val="nil"/>
-            </w:pBdr>
-            <w:shd w:fill="auto" w:val="clear"/>
-            <w:spacing w:after="0" w:before="0" w:line="276" w:lineRule="auto"/>
-            <w:ind w:left="0" w:right="0" w:firstLine="0"/>
-            <w:jc w:val="left"/>
             <w:rPr>
               <w:rFonts w:ascii="Times New Roman" w:cs="Times New Roman" w:eastAsia="Times New Roman" w:hAnsi="Times New Roman"/>
             </w:rPr>
@@ -2933,21 +2150,7 @@
         </w:tcPr>
         <w:p>
           <w:pPr>
-            <w:keepNext w:val="0"/>
-            <w:keepLines w:val="0"/>
-            <w:pageBreakBefore w:val="0"/>
             <w:widowControl w:val="0"/>
-            <w:pBdr>
-              <w:top w:space="0" w:sz="0" w:val="nil"/>
-              <w:left w:space="0" w:sz="0" w:val="nil"/>
-              <w:bottom w:space="0" w:sz="0" w:val="nil"/>
-              <w:right w:space="0" w:sz="0" w:val="nil"/>
-              <w:between w:space="0" w:sz="0" w:val="nil"/>
-            </w:pBdr>
-            <w:shd w:fill="auto" w:val="clear"/>
-            <w:spacing w:after="0" w:before="0" w:line="276" w:lineRule="auto"/>
-            <w:ind w:left="0" w:right="0" w:firstLine="0"/>
-            <w:jc w:val="left"/>
             <w:rPr>
               <w:rFonts w:ascii="Times New Roman" w:cs="Times New Roman" w:eastAsia="Times New Roman" w:hAnsi="Times New Roman"/>
               <w:sz w:val="20"/>
@@ -2975,21 +2178,7 @@
         </w:tcPr>
         <w:p>
           <w:pPr>
-            <w:keepNext w:val="0"/>
-            <w:keepLines w:val="0"/>
-            <w:pageBreakBefore w:val="0"/>
             <w:widowControl w:val="0"/>
-            <w:pBdr>
-              <w:top w:space="0" w:sz="0" w:val="nil"/>
-              <w:left w:space="0" w:sz="0" w:val="nil"/>
-              <w:bottom w:space="0" w:sz="0" w:val="nil"/>
-              <w:right w:space="0" w:sz="0" w:val="nil"/>
-              <w:between w:space="0" w:sz="0" w:val="nil"/>
-            </w:pBdr>
-            <w:shd w:fill="auto" w:val="clear"/>
-            <w:spacing w:after="0" w:before="0" w:line="276" w:lineRule="auto"/>
-            <w:ind w:left="0" w:right="0" w:firstLine="0"/>
-            <w:jc w:val="left"/>
             <w:rPr>
               <w:rFonts w:ascii="Times New Roman" w:cs="Times New Roman" w:eastAsia="Times New Roman" w:hAnsi="Times New Roman"/>
               <w:sz w:val="20"/>
@@ -3005,6 +2194,17 @@
       </w:tc>
     </w:tr>
   </w:tbl>
+  <w:p>
+    <w:pPr>
+      <w:spacing w:line="276" w:lineRule="auto"/>
+      <w:rPr/>
+    </w:pPr>
+    <w:r>
+      <w:rPr>
+        <w:rtl w:val="0"/>
+      </w:rPr>
+    </w:r>
+  </w:p>
   <w:p>
     <w:pPr>
       <w:rPr/>

</xml_diff>